<commit_message>
Update portfolio: DomeGallery photography, experience details, footer mobile optimization, testimonials improvements
- Replace photo reel with 3D DomeGallery component (reactbits) using all 42 photos
- Add detailed role data for JP Morgan (3 roles) and Deloitte with merged summaries
- Optimize footer for mobile with compact single-column layout
- Improve testimonials/recognition section with desktop card width and mobile read-more
- Remove old experiment pages, add photography and hero-zoom experiments
- Update photography images and resume files
</commit_message>
<xml_diff>
--- a/public/resume.docx
+++ b/public/resume.docx
@@ -86,7 +86,7 @@
           <w:sz w:val="18"/>
           <w:szCs w:val="18"/>
         </w:rPr>
-        <w:t xml:space="preserve">Mumbai, MH  | 8890033399  | </w:t>
+        <w:t xml:space="preserve">Mumbai, MH  | </w:t>
       </w:r>
       <w:hyperlink r:id="rId7">
         <w:r>
@@ -436,36 +436,8 @@
           <w:sz w:val="18"/>
           <w:szCs w:val="18"/>
         </w:rPr>
-        <w:t xml:space="preserve">Python, Java, UiPath, Alteryx, Tableau, Playwright, Selenium, SQL, APIs, CI/CD, Data Pipelines, RPA, Automation Framework Design, </w:t>
-      </w:r>
-      <w:proofErr w:type="spellStart"/>
-      <w:r>
-        <w:rPr>
-          <w:rFonts w:ascii="Merriweather" w:eastAsia="Merriweather" w:hAnsi="Merriweather" w:cs="Merriweather"/>
-          <w:sz w:val="18"/>
-          <w:szCs w:val="18"/>
-        </w:rPr>
-        <w:t>BitBucket</w:t>
-      </w:r>
-      <w:proofErr w:type="spellEnd"/>
-      <w:r>
-        <w:rPr>
-          <w:rFonts w:ascii="Merriweather" w:eastAsia="Merriweather" w:hAnsi="Merriweather" w:cs="Merriweather"/>
-          <w:sz w:val="18"/>
-          <w:szCs w:val="18"/>
-        </w:rPr>
-        <w:t xml:space="preserve">, </w:t>
-      </w:r>
-      <w:proofErr w:type="spellStart"/>
-      <w:r>
-        <w:rPr>
-          <w:rFonts w:ascii="Merriweather" w:eastAsia="Merriweather" w:hAnsi="Merriweather" w:cs="Merriweather"/>
-          <w:sz w:val="18"/>
-          <w:szCs w:val="18"/>
-        </w:rPr>
-        <w:t>Github</w:t>
-      </w:r>
-      <w:proofErr w:type="spellEnd"/>
+        <w:t>Python, Java, UiPath, Alteryx, Tableau, Playwright, Selenium, SQL, APIs, CI/CD, Data Pipelines, RPA, Automation Framework Design, BitBucket, Github</w:t>
+      </w:r>
     </w:p>
     <w:p>
       <w:pPr>
@@ -1036,25 +1008,7 @@
           <w:sz w:val="18"/>
           <w:szCs w:val="18"/>
         </w:rPr>
-        <w:t xml:space="preserve">Dashboard and EOD reporting system integrating data from </w:t>
-      </w:r>
-      <w:proofErr w:type="spellStart"/>
-      <w:r>
-        <w:rPr>
-          <w:rFonts w:ascii="Merriweather" w:eastAsia="Merriweather" w:hAnsi="Merriweather" w:cs="Merriweather"/>
-          <w:sz w:val="18"/>
-          <w:szCs w:val="18"/>
-        </w:rPr>
-        <w:t>qTest</w:t>
-      </w:r>
-      <w:proofErr w:type="spellEnd"/>
-      <w:r>
-        <w:rPr>
-          <w:rFonts w:ascii="Merriweather" w:eastAsia="Merriweather" w:hAnsi="Merriweather" w:cs="Merriweather"/>
-          <w:sz w:val="18"/>
-          <w:szCs w:val="18"/>
-        </w:rPr>
-        <w:t>, JIRA and Confluence for 500+ users, driving transparency and leadership decision-making.</w:t>
+        <w:t>Dashboard and EOD reporting system integrating data from qTest, JIRA and Confluence for 500+ users, driving transparency and leadership decision-making.</w:t>
       </w:r>
     </w:p>
     <w:p>
@@ -1233,7 +1187,29 @@
           <w:sz w:val="18"/>
           <w:szCs w:val="18"/>
         </w:rPr>
-        <w:t xml:space="preserve">Achieved 99% time reduction </w:t>
+        <w:t xml:space="preserve">Achieved </w:t>
+      </w:r>
+      <w:proofErr w:type="gramStart"/>
+      <w:r>
+        <w:rPr>
+          <w:rFonts w:ascii="Merriweather" w:eastAsia="Merriweather" w:hAnsi="Merriweather" w:cs="Merriweather"/>
+          <w:b/>
+          <w:bCs/>
+          <w:sz w:val="18"/>
+          <w:szCs w:val="18"/>
+        </w:rPr>
+        <w:t>99% time</w:t>
+      </w:r>
+      <w:proofErr w:type="gramEnd"/>
+      <w:r>
+        <w:rPr>
+          <w:rFonts w:ascii="Merriweather" w:eastAsia="Merriweather" w:hAnsi="Merriweather" w:cs="Merriweather"/>
+          <w:b/>
+          <w:bCs/>
+          <w:sz w:val="18"/>
+          <w:szCs w:val="18"/>
+        </w:rPr>
+        <w:t xml:space="preserve"> reduction </w:t>
       </w:r>
       <w:r>
         <w:rPr>
@@ -1314,25 +1290,7 @@
           <w:sz w:val="18"/>
           <w:szCs w:val="18"/>
         </w:rPr>
-        <w:t xml:space="preserve">+ </w:t>
-      </w:r>
-      <w:proofErr w:type="spellStart"/>
-      <w:r>
-        <w:rPr>
-          <w:rFonts w:ascii="Merriweather" w:eastAsia="Merriweather" w:hAnsi="Merriweather" w:cs="Merriweather"/>
-          <w:sz w:val="18"/>
-          <w:szCs w:val="18"/>
-        </w:rPr>
-        <w:t>Streamlit</w:t>
-      </w:r>
-      <w:proofErr w:type="spellEnd"/>
-      <w:r>
-        <w:rPr>
-          <w:rFonts w:ascii="Merriweather" w:eastAsia="Merriweather" w:hAnsi="Merriweather" w:cs="Merriweather"/>
-          <w:sz w:val="18"/>
-          <w:szCs w:val="18"/>
-        </w:rPr>
-        <w:t xml:space="preserve"> automation platform enabling non-tech &amp; business users to book &amp; test Brokerage products trades via browser without technical setup. </w:t>
+        <w:t xml:space="preserve">+ Streamlit automation platform enabling non-tech &amp; business users to book &amp; test Brokerage products trades via browser without technical setup. </w:t>
       </w:r>
       <w:r>
         <w:rPr>
@@ -1521,25 +1479,7 @@
           <w:sz w:val="18"/>
           <w:szCs w:val="18"/>
         </w:rPr>
-        <w:t xml:space="preserve">dashboard suite integrated with </w:t>
-      </w:r>
-      <w:proofErr w:type="spellStart"/>
-      <w:r>
-        <w:rPr>
-          <w:rFonts w:ascii="Merriweather" w:eastAsia="Merriweather" w:hAnsi="Merriweather" w:cs="Merriweather"/>
-          <w:sz w:val="18"/>
-          <w:szCs w:val="18"/>
-        </w:rPr>
-        <w:t>qTest</w:t>
-      </w:r>
-      <w:proofErr w:type="spellEnd"/>
-      <w:r>
-        <w:rPr>
-          <w:rFonts w:ascii="Merriweather" w:eastAsia="Merriweather" w:hAnsi="Merriweather" w:cs="Merriweather"/>
-          <w:sz w:val="18"/>
-          <w:szCs w:val="18"/>
-        </w:rPr>
-        <w:t xml:space="preserve">, JIRA, and Confluence APIs for PMOD project insights. </w:t>
+        <w:t xml:space="preserve">dashboard suite integrated with qTest, JIRA, and Confluence APIs for PMOD project insights. </w:t>
       </w:r>
       <w:r>
         <w:rPr>
@@ -2179,7 +2119,25 @@
           <w:sz w:val="18"/>
           <w:szCs w:val="18"/>
         </w:rPr>
-        <w:t>and daily execution of a robust data integrity process which led to restriction of poor information mails being delivered on a daily basis to US Citizens.</w:t>
+        <w:t xml:space="preserve">and daily execution of a robust data integrity process which led to restriction of poor information mails being delivered </w:t>
+      </w:r>
+      <w:proofErr w:type="gramStart"/>
+      <w:r>
+        <w:rPr>
+          <w:rFonts w:ascii="Merriweather" w:eastAsia="Merriweather" w:hAnsi="Merriweather" w:cs="Merriweather"/>
+          <w:sz w:val="18"/>
+          <w:szCs w:val="18"/>
+        </w:rPr>
+        <w:t>on a daily basis</w:t>
+      </w:r>
+      <w:proofErr w:type="gramEnd"/>
+      <w:r>
+        <w:rPr>
+          <w:rFonts w:ascii="Merriweather" w:eastAsia="Merriweather" w:hAnsi="Merriweather" w:cs="Merriweather"/>
+          <w:sz w:val="18"/>
+          <w:szCs w:val="18"/>
+        </w:rPr>
+        <w:t xml:space="preserve"> to US Citizens.</w:t>
       </w:r>
     </w:p>
     <w:p>
@@ -2382,29 +2340,7 @@
           <w:sz w:val="18"/>
           <w:szCs w:val="18"/>
         </w:rPr>
-        <w:t xml:space="preserve">MBA, Post Graduate </w:t>
-      </w:r>
-      <w:proofErr w:type="spellStart"/>
-      <w:r>
-        <w:rPr>
-          <w:rFonts w:ascii="Merriweather" w:eastAsia="Merriweather" w:hAnsi="Merriweather" w:cs="Merriweather"/>
-          <w:b/>
-          <w:bCs/>
-          <w:sz w:val="18"/>
-          <w:szCs w:val="18"/>
-        </w:rPr>
-        <w:t>Programme</w:t>
-      </w:r>
-      <w:proofErr w:type="spellEnd"/>
-      <w:r>
-        <w:rPr>
-          <w:rFonts w:ascii="Merriweather" w:eastAsia="Merriweather" w:hAnsi="Merriweather" w:cs="Merriweather"/>
-          <w:b/>
-          <w:bCs/>
-          <w:sz w:val="18"/>
-          <w:szCs w:val="18"/>
-        </w:rPr>
-        <w:t xml:space="preserve"> in General Management</w:t>
+        <w:t>MBA, Post Graduate Programme in General Management</w:t>
       </w:r>
       <w:r>
         <w:rPr>

</xml_diff>